<commit_message>
Make project entrypoint reader-facing
</commit_message>
<xml_diff>
--- a/docs/final_report.docx
+++ b/docs/final_report.docx
@@ -27,7 +27,7 @@
           <w:color w:val="444444"/>
           <w:sz w:val="28"/>
         </w:rPr>
-        <w:t>Final Project Report Draft for Coach and Cohort Review</w:t>
+        <w:t>Final Project Report Draft</w:t>
       </w:r>
     </w:p>
     <w:p>
@@ -129,7 +129,7 @@
         <w:pStyle w:val="Heading1"/>
       </w:pPr>
       <w:r>
-        <w:t>Reviewer Roadmap</w:t>
+        <w:t>Reader Roadmap</w:t>
       </w:r>
     </w:p>
     <w:tbl>
@@ -157,7 +157,7 @@
                 <w:color w:val="244062"/>
                 <w:sz w:val="20"/>
               </w:rPr>
-              <w:t>Recommended review path: read README.md, scan this report, run or inspect the Streamlit app, then review data documentation and responsible AI boundaries.</w:t>
+              <w:t>Recommended reading path: read README.md, scan this report, run or inspect the Streamlit app, then read the data documentation and responsible AI boundaries.</w:t>
             </w:r>
           </w:p>
         </w:tc>
@@ -169,7 +169,7 @@
         <w:rPr>
           <w:b/>
         </w:rPr>
-        <w:t>Artifact map for coaches and cohort reviewers:</w:t>
+        <w:t>Artifact map for readers:</w:t>
       </w:r>
     </w:p>
     <w:tbl>
@@ -324,14 +324,15 @@
             <w:pPr>
               <w:spacing w:after="0"/>
             </w:pPr>
-            <w:r/>
+            <w:r>
+              <w:t>Project walkthrough</w:t>
+            </w:r>
             <w:r>
               <w:rPr>
                 <w:rFonts w:ascii="Aptos" w:hAnsi="Aptos" w:eastAsia="Aptos"/>
                 <w:b w:val="0"/>
                 <w:sz w:val="19"/>
               </w:rPr>
-              <w:t>Coach guide</w:t>
             </w:r>
           </w:p>
         </w:tc>
@@ -344,14 +345,15 @@
             <w:pPr>
               <w:spacing w:after="0"/>
             </w:pPr>
-            <w:r/>
+            <w:r>
+              <w:t>docs/project_walkthrough.md</w:t>
+            </w:r>
             <w:r>
               <w:rPr>
                 <w:rFonts w:ascii="Aptos" w:hAnsi="Aptos" w:eastAsia="Aptos"/>
                 <w:b w:val="0"/>
                 <w:sz w:val="19"/>
               </w:rPr>
-              <w:t>docs/coach_review_guide.md</w:t>
             </w:r>
           </w:p>
         </w:tc>
@@ -364,14 +366,15 @@
             <w:pPr>
               <w:spacing w:after="0"/>
             </w:pPr>
-            <w:r/>
+            <w:r>
+              <w:t>One-page map of the repository.</w:t>
+            </w:r>
             <w:r>
               <w:rPr>
                 <w:rFonts w:ascii="Aptos" w:hAnsi="Aptos" w:eastAsia="Aptos"/>
                 <w:b w:val="0"/>
                 <w:sz w:val="19"/>
               </w:rPr>
-              <w:t>One-page walkthrough for reviewers.</w:t>
             </w:r>
           </w:p>
         </w:tc>
@@ -859,7 +862,7 @@
     </w:p>
     <w:p>
       <w:r>
-        <w:t>The project also has a classroom and reviewer audience. Coaches and other AI Campus teams should be able to open the GitHub repository, understand the source data and model boundaries, run or inspect a small prototype, and see exactly where the larger raw files remain outside GitHub.</w:t>
+        <w:t>The project also has a broader classroom and public-facing audience. A reader should be able to open the GitHub repository, understand the source data and model boundaries, run or inspect a small prototype, and see exactly where the larger raw files remain outside GitHub.</w:t>
       </w:r>
     </w:p>
     <w:p>
@@ -942,7 +945,7 @@
     </w:p>
     <w:p>
       <w:r>
-        <w:t>The raw workbook and large intermediate files should remain in the team Google Drive. GitHub is used for code, notebooks, documentation, small processed review data, and reproducibility instructions. This protects the repository from becoming a dumping ground for large raw data while still giving reviewers a runnable project package.</w:t>
+        <w:t>The raw workbook and large intermediate files should remain in the team Google Drive. GitHub is used for code, notebooks, documentation, small processed project data, and reproducibility instructions. This protects the repository from becoming a dumping ground for large raw data while still giving readers a runnable project package.</w:t>
       </w:r>
     </w:p>
     <w:p>
@@ -965,7 +968,7 @@
     </w:p>
     <w:p>
       <w:r>
-        <w:t>The current final extract should be viewed as a review-ready processed artifact. It is enough for a prototype demonstration and coach review, but it is not a fully automated production data pipeline. A future version should include a reproducible command-line script that rebuilds the GitHub extract from the Drive workbook and records source file dates, checksums, and row counts.</w:t>
+        <w:t>The current final extract should be viewed as a reader-ready processed artifact. It is enough for a prototype demonstration, but it is not a fully automated production data pipeline. A future version should include a reproducible command-line script that rebuilds the GitHub extract from the Drive workbook and records source file dates, checksums, and row counts.</w:t>
       </w:r>
     </w:p>
     <w:p>
@@ -1406,7 +1409,7 @@
     <w:p/>
     <w:p>
       <w:r>
-        <w:t>The final GitHub review extract contains 213 New Jersey behavioral health facility records. All rows in the committed extract are New Jersey records, and the file includes both decoded facility attributes and derived K-Means tier labels. This gives reviewers a concrete artifact to inspect rather than a purely conceptual proposal.</w:t>
+        <w:t>The final GitHub extract contains 213 New Jersey behavioral health facility records. All rows in the committed extract are New Jersey records, and the file includes both decoded facility attributes and derived K-Means tier labels. This gives readers a concrete artifact to inspect rather than a purely conceptual proposal.</w:t>
       </w:r>
     </w:p>
     <w:p>
@@ -1457,7 +1460,7 @@
     </w:p>
     <w:p>
       <w:r>
-        <w:t>The sidebar allows a reviewer to select care need, payment or funding signal, service setting, care-bundle tier, city, and a free-text search query. The main view displays facility cards with facility name, location, type of care, service setting, matched signals, payment/funding text, ancillary services, phone where available, and source-confidence language.</w:t>
+        <w:t>The sidebar allows a user to select care need, payment or funding signal, service setting, care-bundle tier, city, and a free-text search query. The main view displays facility cards with facility name, location, type of care, service setting, matched signals, payment/funding text, ancillary services, phone where available, and source-confidence language.</w:t>
       </w:r>
     </w:p>
     <w:p>
@@ -1526,12 +1529,12 @@
     </w:p>
     <w:p>
       <w:r>
-        <w:t>The project is ready for coach review as a prototype package once the pull request is merged and the repository is made accessible. It is not ready for production healthcare deployment.</w:t>
+        <w:t>The project is ready to read and inspect as a prototype package once the repository is made accessible. It is not ready for production healthcare deployment.</w:t>
       </w:r>
     </w:p>
     <w:p>
       <w:r>
-        <w:t>Before sharing with coaches, the repository should be public or coaches should be added with explicit access. The README should be the first stop, followed by the coach review guide, final report, app, notebooks, data documentation, and responsible AI memo.</w:t>
+        <w:t>Before sharing broadly, the repository should be public or intended readers should be added with explicit access. The README should be the first stop, followed by the project walkthrough, final report, app, notebooks, data documentation, and responsible AI memo.</w:t>
       </w:r>
     </w:p>
     <w:p>
@@ -1572,7 +1575,7 @@
     </w:p>
     <w:p>
       <w:r>
-        <w:t>The Behavioral Health Access Navigator turns scattered public facility information into a more usable review workflow for New Jersey behavioral health navigation. The final GitHub package gives reviewers a coherent path through the project: source documentation, processed data, notebooks, prototype, responsible AI boundaries, deployment readiness, and a polished report draft.</w:t>
+        <w:t>The Behavioral Health Access Navigator turns scattered public facility information into a more usable review workflow for New Jersey behavioral health navigation. The final GitHub package gives readers a coherent path through the project: source documentation, processed data, notebooks, prototype, responsible AI boundaries, deployment readiness, and a polished report draft.</w:t>
       </w:r>
     </w:p>
     <w:p>
@@ -1601,11 +1604,9 @@
         <w:rPr>
           <w:b/>
         </w:rPr>
-        <w:t xml:space="preserve">[ ] </w:t>
+        <w:t>[ ] The README tells a reader where to begin.</w:t>
       </w:r>
-      <w:r>
-        <w:t>The README tells a reviewer where to begin.</w:t>
-      </w:r>
+      <w:r/>
     </w:p>
     <w:p>
       <w:pPr>
@@ -1685,11 +1686,9 @@
         <w:rPr>
           <w:b/>
         </w:rPr>
-        <w:t xml:space="preserve">[ ] </w:t>
+        <w:t>[ ] Repo visibility or reader permissions are resolved before the team shares the link.</w:t>
       </w:r>
-      <w:r>
-        <w:t>Repo visibility or reviewer permissions are resolved before the team shares the link.</w:t>
-      </w:r>
+      <w:r/>
     </w:p>
     <w:sectPr>
       <w:footerReference w:type="default" r:id="rId9"/>
@@ -1714,7 +1713,7 @@
         <w:color w:val="646464"/>
         <w:sz w:val="16"/>
       </w:rPr>
-      <w:t>Behavioral Health Access Navigator - Final report draft for review</w:t>
+      <w:t>Behavioral Health Access Navigator - Final project report draft</w:t>
     </w:r>
   </w:p>
 </w:ftr>

</xml_diff>

<commit_message>
Clarify tiering and runtime scoring
</commit_message>
<xml_diff>
--- a/docs/final_report.docx
+++ b/docs/final_report.docx
@@ -550,17 +550,8 @@
             <w:vAlign w:val="center"/>
           </w:tcPr>
           <w:p>
-            <w:pPr>
-              <w:spacing w:after="0"/>
-            </w:pPr>
-            <w:r/>
             <w:r>
-              <w:rPr>
-                <w:rFonts w:ascii="Aptos" w:hAnsi="Aptos" w:eastAsia="Aptos"/>
-                <w:b w:val="0"/>
-                <w:sz w:val="19"/>
-              </w:rPr>
-              <w:t>213 New Jersey facility records with decoded service fields and K-Means tiers.</w:t>
+              <w:t>213 New Jersey facility records with decoded service fields and K-Means-derived tiers.</w:t>
             </w:r>
           </w:p>
         </w:tc>
@@ -834,7 +825,7 @@
     </w:p>
     <w:p>
       <w:r>
-        <w:t>The current GitHub package centers on a processed extract from SAMHSA National Mental Health Directory 2024 facility directory material. The team cleaned and decoded facility-level service fields, filtered the processed artifact to New Jersey, and added K-Means care-bundle tier labels that summarize service patterns. The final committed review extract contains 213 New Jersey facility rows and 57 columns.</w:t>
+        <w:t>The current GitHub package centers on a processed extract from SAMHSA National Mental Health Directory 2024 facility directory material. The team cleaned and decoded facility-level service fields, filtered the processed artifact to New Jersey, and added K-Means-derived care-bundle tier labels that summarize service patterns. The final committed review extract contains 213 New Jersey facility rows and 57 columns.</w:t>
       </w:r>
     </w:p>
     <w:p>
@@ -991,7 +982,13 @@
     </w:p>
     <w:p>
       <w:r>
-        <w:t>Facility tiering uses K-Means clustering on binarized ancillary and recovery-support service indicators. The resulting tier labels are care-bundle summaries. They should not be read as quality scores, provider rankings, or clinical recommendations.</w:t>
+        <w:t>Facility tiering in the notebook workflow uses K-Means clustering on binarized ancillary and recovery-support service indicators. The resulting tier labels are care-bundle summaries. They should not be read as quality scores, provider rankings, or clinical recommendations.</w:t>
+      </w:r>
+    </w:p>
+    <w:p>
+      <w:pPr/>
+      <w:r>
+        <w:t>The committed Streamlit prototype is intentionally simpler than the full exploratory notebook. It does not rerun K-Means, KNN, or semantic embeddings at runtime. Instead, it loads the 213-row New Jersey extract, applies deterministic filters and keyword/payment/query match scoring, and displays the precomputed tier label as interpretation context.</w:t>
       </w:r>
     </w:p>
     <w:p>
@@ -1414,7 +1411,7 @@
     </w:p>
     <w:p>
       <w:r>
-        <w:t>The Streamlit prototype uses the extract to filter and display facilities by care need, service setting, payment/funding signal, city, and tier. It also shows simple match signals so a user can see why a facility appeared in the results. The default filter path loads all 213 records, and narrower filters produce smaller review lists.</w:t>
+        <w:t>The Streamlit prototype uses the extract to filter and display facilities by care need, service setting, payment/funding signal, city, and tier. It also shows simple match signals so a user can see why a facility appeared in the results. Those match signals are deterministic keyword and field matches, not live model predictions. The default filter path loads all 213 records, and narrower filters produce smaller review lists.</w:t>
       </w:r>
     </w:p>
     <w:p>
@@ -1511,7 +1508,7 @@
     </w:p>
     <w:p>
       <w:r>
-        <w:t>The prototype also has technical limits. It relies on simple filters and text matching, and the committed app does not perform live semantic embedding calls. The notebooks explore richer ranking ideas, but the review app favors simplicity and local reproducibility.</w:t>
+        <w:t>The prototype also has technical limits. It relies on simple filters and text matching, and the committed app does not perform live semantic embedding calls, K-Means clustering, or KNN. The notebooks explore richer ranking ideas, but the review app favors simplicity and local reproducibility.</w:t>
       </w:r>
     </w:p>
     <w:p>
@@ -1641,13 +1638,7 @@
         <w:ind w:left="360"/>
       </w:pPr>
       <w:r>
-        <w:rPr>
-          <w:b/>
-        </w:rPr>
-        <w:t xml:space="preserve">[ ] </w:t>
-      </w:r>
-      <w:r>
-        <w:t>K-Means is described as unsupervised tiering, not KNN.</w:t>
+        <w:t>[ ] K-Means is described as unsupervised tiering, not KNN, and is distinguished from the prototype runtime scoring.</w:t>
       </w:r>
     </w:p>
     <w:p>

</xml_diff>

<commit_message>
Keep editable final report and slides only
</commit_message>
<xml_diff>
--- a/docs/final_report.docx
+++ b/docs/final_report.docx
@@ -2029,18 +2029,6 @@
               <w:rPr>
                 <w:rStyle w:val="VerbatimChar"/>
               </w:rPr>
-              <w:t xml:space="preserve">docs/final_report.pdf</w:t>
-            </w:r>
-            <w:r>
-              <w:t xml:space="preserve">,</w:t>
-            </w:r>
-            <w:r>
-              <w:t xml:space="preserve"> </w:t>
-            </w:r>
-            <w:r>
-              <w:rPr>
-                <w:rStyle w:val="VerbatimChar"/>
-              </w:rPr>
               <w:t xml:space="preserve">docs/final_report.md</w:t>
             </w:r>
           </w:p>
@@ -2052,7 +2040,7 @@
               <w:pStyle w:val="Compact"/>
             </w:pPr>
             <w:r>
-              <w:t xml:space="preserve">What did the team build and how should it be interpreted?</w:t>
+              <w:t xml:space="preserve">What did the team build and how should it be interpreted? The team should export the final PDF manually after reviewing the DOCX.</w:t>
             </w:r>
           </w:p>
         </w:tc>
@@ -3054,7 +3042,7 @@
         <w:pStyle w:val="FirstParagraph"/>
       </w:pPr>
       <w:r>
-        <w:t xml:space="preserve">The final submission package should include the public GitHub link, this report as a PDF, and the final presentation slides. The GitHub link is the best single entry point because it connects readers to the README, notebooks, data extract, app, documentation, report files, and presentation draft.</w:t>
+        <w:t xml:space="preserve">The final submission package should include the public GitHub link, this report exported manually as a PDF after team review, and the final presentation slides. The GitHub link is the best single entry point because it connects readers to the README, notebooks, data extract, app, documentation, report files, and presentation draft.</w:t>
       </w:r>
     </w:p>
     <w:p>
@@ -3253,7 +3241,7 @@
               <w:pStyle w:val="Compact"/>
             </w:pPr>
             <w:r>
-              <w:t xml:space="preserve">Final report is available as PDF</w:t>
+              <w:t xml:space="preserve">Final report is ready for PDF export</w:t>
             </w:r>
           </w:p>
         </w:tc>
@@ -3275,7 +3263,7 @@
               <w:pStyle w:val="Compact"/>
             </w:pPr>
             <w:r>
-              <w:t xml:space="preserve">The report is stored in</w:t>
+              <w:t xml:space="preserve">The editable report is stored in</w:t>
             </w:r>
             <w:r>
               <w:t xml:space="preserve"> </w:t>
@@ -3284,10 +3272,10 @@
               <w:rPr>
                 <w:rStyle w:val="VerbatimChar"/>
               </w:rPr>
-              <w:t xml:space="preserve">docs/final_report.pdf</w:t>
-            </w:r>
-            <w:r>
-              <w:t xml:space="preserve">.</w:t>
+              <w:t xml:space="preserve">docs/final_report.docx</w:t>
+            </w:r>
+            <w:r>
+              <w:t xml:space="preserve">; the team should export the submission PDF manually after review.</w:t>
             </w:r>
           </w:p>
         </w:tc>

</xml_diff>